<commit_message>
Plans d'affaires : prise en compte des observations APEJ/DEJ sur les 7 plans annotés (conclusions, fiches, coquilles, FFOM)
Co-Authored-By: Claude Sonnet 5.5 <noreply@anthropic.com>
Claude-Session: https://claude.ai/code/session_01KyQJNf3eAtEsiLVGoSnTyL
</commit_message>
<xml_diff>
--- a/Awa/PA AWA - actualisé.docx
+++ b/Awa/PA AWA - actualisé.docx
@@ -693,7 +693,7 @@
             </w:pPr>
             <w:r>
               <w:rPr/>
-              <w:t>Maraichage -</w:t>
+              <w:t>Maraîchage -</w:t>
             </w:r>
           </w:p>
         </w:tc>
@@ -1123,7 +1123,7 @@
             </w:tabs>
             <w:rPr/>
           </w:pPr>
-          <w:hyperlink w:anchor="__RefHeading___Toc24421_3889484913">
+          <w:hyperlink w:anchor="__RefHeading___Toc24421_3508533786">
             <w:r>
               <w:rPr>
                 <w:webHidden/>
@@ -1471,7 +1471,7 @@
             </w:tabs>
             <w:rPr/>
           </w:pPr>
-          <w:hyperlink w:anchor="__RefHeading___Toc24423_3889484913">
+          <w:hyperlink w:anchor="__RefHeading___Toc24423_3508533786">
             <w:r>
               <w:rPr>
                 <w:webHidden/>
@@ -5878,7 +5878,7 @@
           <w:lang w:eastAsia="en-US"/>
         </w:rPr>
       </w:pPr>
-      <w:bookmarkStart w:id="1" w:name="__RefHeading___Toc24421_3889484913"/>
+      <w:bookmarkStart w:id="1" w:name="__RefHeading___Toc24421_3508533786"/>
       <w:bookmarkEnd w:id="1"/>
       <w:r>
         <w:rPr/>
@@ -9088,7 +9088,7 @@
       </w:pPr>
       <w:r>
         <w:rPr/>
-        <w:t xml:space="preserve">La politique de produit est axée sur la production de produits maraîchers bio qui sont demandés durant toute l’année (piment et pastèque). Cela permet de rassurer l’entreprise et de soutenir la production. La marque </w:t>
+        <w:t xml:space="preserve">La politique de produit est axée sur la production de produits maraîchers bio qui sont demandés durant toute l’année (piment et pastèque). Cela vise à fidéliser la clientèle et à assurer l’écoulement régulier de la production. La marque </w:t>
       </w:r>
       <w:r>
         <w:rPr>
@@ -10255,7 +10255,7 @@
               <w:rPr>
                 <w:color w:val="000000"/>
               </w:rPr>
-              <w:t>Suppresseur solaire</w:t>
+              <w:t>Surpresseur solaire</w:t>
             </w:r>
           </w:p>
         </w:tc>
@@ -13014,7 +13014,7 @@
           <w:lang w:val="fr-CI"/>
         </w:rPr>
       </w:pPr>
-      <w:bookmarkStart w:id="14" w:name="__RefHeading___Toc24423_3889484913"/>
+      <w:bookmarkStart w:id="14" w:name="__RefHeading___Toc24423_3508533786"/>
       <w:bookmarkEnd w:id="14"/>
       <w:r>
         <w:rPr>
@@ -21256,7 +21256,7 @@
             </w:pPr>
             <w:r>
               <w:rPr/>
-              <w:t>Suppresseur solaire</w:t>
+              <w:t>Surpresseur solaire</w:t>
             </w:r>
           </w:p>
         </w:tc>
@@ -21403,7 +21403,7 @@
             </w:pPr>
             <w:r>
               <w:rPr/>
-              <w:t>-</w:t>
+              <w:t>150 000</w:t>
             </w:r>
           </w:p>
         </w:tc>
@@ -34226,7 +34226,7 @@
               <w:rPr>
                 <w:color w:val="000000"/>
               </w:rPr>
-              <w:t>Suppresseur solaire</w:t>
+              <w:t>Surpresseur solaire</w:t>
             </w:r>
           </w:p>
         </w:tc>
@@ -46051,7 +46051,7 @@
                   </w:pPr>
                   <w:r>
                     <w:rPr/>
-                    <w:t>Suppresseur solaire</w:t>
+                    <w:t>Surpresseur solaire</w:t>
                   </w:r>
                 </w:p>
               </w:tc>
@@ -54546,7 +54546,7 @@
             </w:pPr>
             <w:r>
               <w:rPr/>
-              <w:t>Ratio de couverture de la dette proche de 1 la première année.</w:t>
+              <w:t>Capacité d’autofinancement inférieure au remboursement du capital pendant les trois années du prêt.</w:t>
             </w:r>
           </w:p>
           <w:p>
@@ -55110,7 +55110,7 @@
       </w:pPr>
       <w:r>
         <w:rPr/>
-        <w:t xml:space="preserve">En examinant les ratios de rentabilité économique et financière, le présent projet présente une rentabilité fragile, sous réserve de la validation des hypothèses de rendement, de prix et de besoin en fonds de roulement et contribue à la création de quatre (4) emplois directs, dont une gérante-promotrice, une main-d’œuvre permanente, une main-d’œuvre journalière et un commercial. Le taux de rentabilité interne (11 %), la valeur actuelle nette (475 918 F CFA) ainsi que le délai de récupération des capitaux investis (3 ans et 10 mois) indiquent une rentabilité modeste du projet de création de l’entreprise </w:t>
+        <w:t xml:space="preserve">En examinant les ratios de rentabilité économique et financière, on constate que le présent projet dégage une rentabilité faible et ne permet pas, en l’état, de couvrir le remboursement du crédit sollicité et contribue à la création de quatre (4) emplois directs, dont une gérante-promotrice, une main-d’œuvre permanente, une main-d’œuvre journalière et un commercial. Le taux de rentabilité interne (11 %), la valeur actuelle nette (475 918 F CFA) ainsi que le délai de récupération des capitaux investis (3 ans et 10 mois) indiquent une rentabilité modeste du projet de création de l’entreprise </w:t>
       </w:r>
       <w:r>
         <w:rPr>

</xml_diff>

<commit_message>
Plans d'affaires : tableaux de variétés retirés, mention des factures pro forma non fournies, dates et lieux de naissance renseignés
Co-Authored-By: Claude Sonnet 5.5 <noreply@anthropic.com>
Claude-Session: https://claude.ai/code/session_01KyQJNf3eAtEsiLVGoSnTyL
</commit_message>
<xml_diff>
--- a/Awa/PA AWA - actualisé.docx
+++ b/Awa/PA AWA - actualisé.docx
@@ -1123,7 +1123,7 @@
             </w:tabs>
             <w:rPr/>
           </w:pPr>
-          <w:hyperlink w:anchor="__RefHeading___Toc24421_3508533786">
+          <w:hyperlink w:anchor="__RefHeading___Toc24108_4017987919">
             <w:r>
               <w:rPr>
                 <w:webHidden/>
@@ -1241,7 +1241,7 @@
                 <w:rStyle w:val="IndexLink"/>
               </w:rPr>
               <w:tab/>
-              <w:t>5</w:t>
+              <w:t>4</w:t>
             </w:r>
           </w:hyperlink>
         </w:p>
@@ -1277,7 +1277,7 @@
                 <w:rStyle w:val="IndexLink"/>
               </w:rPr>
               <w:tab/>
-              <w:t>6</w:t>
+              <w:t>5</w:t>
             </w:r>
           </w:hyperlink>
         </w:p>
@@ -1301,7 +1301,7 @@
               <w:tab/>
               <w:t>ÉTUDE DE MARCHÉ</w:t>
               <w:tab/>
-              <w:t>6</w:t>
+              <w:t>5</w:t>
             </w:r>
           </w:hyperlink>
         </w:p>
@@ -1325,7 +1325,7 @@
               <w:tab/>
               <w:t>ÉTUDE TECHNIQUE</w:t>
               <w:tab/>
-              <w:t>9</w:t>
+              <w:t>8</w:t>
             </w:r>
           </w:hyperlink>
         </w:p>
@@ -1361,7 +1361,7 @@
                 <w:rStyle w:val="IndexLink"/>
               </w:rPr>
               <w:tab/>
-              <w:t>9</w:t>
+              <w:t>8</w:t>
             </w:r>
           </w:hyperlink>
         </w:p>
@@ -1397,7 +1397,7 @@
                 <w:rStyle w:val="IndexLink"/>
               </w:rPr>
               <w:tab/>
-              <w:t>9</w:t>
+              <w:t>8</w:t>
             </w:r>
           </w:hyperlink>
         </w:p>
@@ -1421,7 +1421,7 @@
               <w:tab/>
               <w:t>Equipements de production :</w:t>
               <w:tab/>
-              <w:t>9</w:t>
+              <w:t>8</w:t>
             </w:r>
           </w:hyperlink>
         </w:p>
@@ -1457,7 +1457,7 @@
                 <w:rStyle w:val="IndexLink"/>
               </w:rPr>
               <w:tab/>
-              <w:t>10</w:t>
+              <w:t>9</w:t>
             </w:r>
           </w:hyperlink>
         </w:p>
@@ -1471,7 +1471,7 @@
             </w:tabs>
             <w:rPr/>
           </w:pPr>
-          <w:hyperlink w:anchor="__RefHeading___Toc24423_3508533786">
+          <w:hyperlink w:anchor="__RefHeading___Toc24110_4017987919">
             <w:r>
               <w:rPr>
                 <w:webHidden/>
@@ -1494,7 +1494,7 @@
               </w:rPr>
               <w:t>(profil et compétences)</w:t>
               <w:tab/>
-              <w:t>11</w:t>
+              <w:t>10</w:t>
             </w:r>
           </w:hyperlink>
         </w:p>
@@ -1518,7 +1518,7 @@
               <w:tab/>
               <w:t>ÉTUDE ÉCONOMIQUE ET FINANCIÈRE</w:t>
               <w:tab/>
-              <w:t>11</w:t>
+              <w:t>10</w:t>
             </w:r>
           </w:hyperlink>
         </w:p>
@@ -1554,7 +1554,7 @@
                 <w:rStyle w:val="IndexLink"/>
               </w:rPr>
               <w:tab/>
-              <w:t>11</w:t>
+              <w:t>10</w:t>
             </w:r>
           </w:hyperlink>
         </w:p>
@@ -1578,7 +1578,7 @@
               <w:tab/>
               <w:t>Recettes prévisionnelles annuelles</w:t>
               <w:tab/>
-              <w:t>11</w:t>
+              <w:t>10</w:t>
             </w:r>
           </w:hyperlink>
         </w:p>
@@ -1602,7 +1602,7 @@
               <w:tab/>
               <w:t>Données prévisionnelles sur les achats</w:t>
               <w:tab/>
-              <w:t>12</w:t>
+              <w:t>10</w:t>
             </w:r>
           </w:hyperlink>
         </w:p>
@@ -1625,7 +1625,7 @@
               <w:tab/>
               <w:t>Achats de matières premières</w:t>
               <w:tab/>
-              <w:t>12</w:t>
+              <w:t>10</w:t>
             </w:r>
           </w:hyperlink>
         </w:p>
@@ -1649,7 +1649,7 @@
               <w:tab/>
               <w:t>Frais Généraux</w:t>
               <w:tab/>
-              <w:t>12</w:t>
+              <w:t>11</w:t>
             </w:r>
           </w:hyperlink>
         </w:p>
@@ -1673,7 +1673,7 @@
               <w:tab/>
               <w:t>Dotations aux amortissements</w:t>
               <w:tab/>
-              <w:t>12</w:t>
+              <w:t>11</w:t>
             </w:r>
           </w:hyperlink>
         </w:p>
@@ -1697,7 +1697,7 @@
               <w:tab/>
               <w:t>Echéancier de remboursement</w:t>
               <w:tab/>
-              <w:t>13</w:t>
+              <w:t>12</w:t>
             </w:r>
           </w:hyperlink>
         </w:p>
@@ -1733,7 +1733,7 @@
                 <w:rStyle w:val="IndexLink"/>
               </w:rPr>
               <w:tab/>
-              <w:t>14</w:t>
+              <w:t>13</w:t>
             </w:r>
           </w:hyperlink>
         </w:p>
@@ -1769,7 +1769,7 @@
                 <w:rStyle w:val="IndexLink"/>
               </w:rPr>
               <w:tab/>
-              <w:t>15</w:t>
+              <w:t>14</w:t>
             </w:r>
           </w:hyperlink>
         </w:p>
@@ -1805,7 +1805,7 @@
                 <w:rStyle w:val="IndexLink"/>
               </w:rPr>
               <w:tab/>
-              <w:t>16</w:t>
+              <w:t>15</w:t>
             </w:r>
           </w:hyperlink>
         </w:p>
@@ -1841,7 +1841,7 @@
                 <w:rStyle w:val="IndexLink"/>
               </w:rPr>
               <w:tab/>
-              <w:t>17</w:t>
+              <w:t>16</w:t>
             </w:r>
           </w:hyperlink>
         </w:p>
@@ -1877,7 +1877,7 @@
                 <w:rStyle w:val="IndexLink"/>
               </w:rPr>
               <w:tab/>
-              <w:t>18</w:t>
+              <w:t>17</w:t>
             </w:r>
           </w:hyperlink>
         </w:p>
@@ -1913,7 +1913,7 @@
                 <w:rStyle w:val="IndexLink"/>
               </w:rPr>
               <w:tab/>
-              <w:t>19</w:t>
+              <w:t>18</w:t>
             </w:r>
           </w:hyperlink>
         </w:p>
@@ -1937,7 +1937,7 @@
               <w:tab/>
               <w:t>ANALYSE DES FORCES, FAIBLESSES, OPPORTUNITÉS ET MENACES</w:t>
               <w:tab/>
-              <w:t>20</w:t>
+              <w:t>19</w:t>
             </w:r>
           </w:hyperlink>
         </w:p>
@@ -1961,7 +1961,7 @@
               <w:tab/>
               <w:t>CONCLUSION</w:t>
               <w:tab/>
-              <w:t>22</w:t>
+              <w:t>21</w:t>
             </w:r>
           </w:hyperlink>
           <w:r>
@@ -5878,7 +5878,7 @@
           <w:lang w:eastAsia="en-US"/>
         </w:rPr>
       </w:pPr>
-      <w:bookmarkStart w:id="1" w:name="__RefHeading___Toc24421_3508533786"/>
+      <w:bookmarkStart w:id="1" w:name="__RefHeading___Toc24108_4017987919"/>
       <w:bookmarkEnd w:id="1"/>
       <w:r>
         <w:rPr/>
@@ -6162,1118 +6162,6 @@
       <w:r>
         <w:rPr/>
         <w:t xml:space="preserve"> (Thunb.) Matsum. &amp; Nakai, est une cucurbitacée adaptée aux mêmes conditions. Ces conditions sont parfaitement réunies à N’gara.</w:t>
-      </w:r>
-    </w:p>
-    <w:p>
-      <w:pPr>
-        <w:pStyle w:val="ds-markdown-paragraph"/>
-        <w:rPr/>
-      </w:pPr>
-      <w:r>
-        <w:rPr/>
-        <w:t>Le tableau ci-dessous présente les variétés de pastèque recommandées pour la zone, sélectionnées pour leur rendement, leur taux de sucre élevé (degrés Brix), leur bonne capacité de conservation et leur adaptation aux climats chauds et secs du Sahel.</w:t>
-      </w:r>
-    </w:p>
-    <w:tbl>
-      <w:tblPr>
-        <w:tblW w:w="9885" w:type="dxa"/>
-        <w:jc w:val="left"/>
-        <w:tblInd w:w="-5" w:type="dxa"/>
-        <w:tblLayout w:type="fixed"/>
-        <w:tblCellMar>
-          <w:top w:w="150" w:type="dxa"/>
-          <w:left w:w="5" w:type="dxa"/>
-          <w:bottom w:w="150" w:type="dxa"/>
-          <w:right w:w="235" w:type="dxa"/>
-        </w:tblCellMar>
-      </w:tblPr>
-      <w:tblGrid>
-        <w:gridCol w:w="1657"/>
-        <w:gridCol w:w="1867"/>
-        <w:gridCol w:w="1448"/>
-        <w:gridCol w:w="4912"/>
-      </w:tblGrid>
-      <w:tr>
-        <w:trPr>
-          <w:tblHeader w:val="true"/>
-        </w:trPr>
-        <w:tc>
-          <w:tcPr>
-            <w:tcW w:w="1657" w:type="dxa"/>
-            <w:tcBorders>
-              <w:top w:val="single" w:sz="4" w:space="0" w:color="000000"/>
-              <w:left w:val="single" w:sz="4" w:space="0" w:color="000000"/>
-              <w:bottom w:val="single" w:sz="4" w:space="0" w:color="000000"/>
-              <w:right w:val="single" w:sz="4" w:space="0" w:color="000000"/>
-            </w:tcBorders>
-            <w:vAlign w:val="center"/>
-          </w:tcPr>
-          <w:p>
-            <w:pPr>
-              <w:pStyle w:val="ds-markdown-paragraph"/>
-              <w:spacing w:before="280" w:after="0"/>
-              <w:rPr/>
-            </w:pPr>
-            <w:r>
-              <w:rPr/>
-              <w:t>Variété</w:t>
-            </w:r>
-          </w:p>
-        </w:tc>
-        <w:tc>
-          <w:tcPr>
-            <w:tcW w:w="1867" w:type="dxa"/>
-            <w:tcBorders>
-              <w:top w:val="single" w:sz="4" w:space="0" w:color="000000"/>
-              <w:left w:val="single" w:sz="4" w:space="0" w:color="000000"/>
-              <w:bottom w:val="single" w:sz="4" w:space="0" w:color="000000"/>
-              <w:right w:val="single" w:sz="4" w:space="0" w:color="000000"/>
-            </w:tcBorders>
-            <w:tcMar>
-              <w:left w:w="240" w:type="dxa"/>
-            </w:tcMar>
-            <w:vAlign w:val="center"/>
-          </w:tcPr>
-          <w:p>
-            <w:pPr>
-              <w:pStyle w:val="ds-markdown-paragraph"/>
-              <w:spacing w:before="280" w:after="0"/>
-              <w:rPr/>
-            </w:pPr>
-            <w:r>
-              <w:rPr/>
-              <w:t>Nom scientifique</w:t>
-            </w:r>
-          </w:p>
-        </w:tc>
-        <w:tc>
-          <w:tcPr>
-            <w:tcW w:w="1448" w:type="dxa"/>
-            <w:tcBorders>
-              <w:top w:val="single" w:sz="4" w:space="0" w:color="000000"/>
-              <w:left w:val="single" w:sz="4" w:space="0" w:color="000000"/>
-              <w:bottom w:val="single" w:sz="4" w:space="0" w:color="000000"/>
-              <w:right w:val="single" w:sz="4" w:space="0" w:color="000000"/>
-            </w:tcBorders>
-            <w:tcMar>
-              <w:left w:w="240" w:type="dxa"/>
-            </w:tcMar>
-            <w:vAlign w:val="center"/>
-          </w:tcPr>
-          <w:p>
-            <w:pPr>
-              <w:pStyle w:val="ds-markdown-paragraph"/>
-              <w:spacing w:before="280" w:after="0"/>
-              <w:rPr/>
-            </w:pPr>
-            <w:r>
-              <w:rPr/>
-              <w:t>Type de chair</w:t>
-            </w:r>
-          </w:p>
-        </w:tc>
-        <w:tc>
-          <w:tcPr>
-            <w:tcW w:w="4912" w:type="dxa"/>
-            <w:tcBorders>
-              <w:top w:val="single" w:sz="4" w:space="0" w:color="000000"/>
-              <w:left w:val="single" w:sz="4" w:space="0" w:color="000000"/>
-              <w:bottom w:val="single" w:sz="4" w:space="0" w:color="000000"/>
-              <w:right w:val="single" w:sz="4" w:space="0" w:color="000000"/>
-            </w:tcBorders>
-            <w:tcMar>
-              <w:left w:w="240" w:type="dxa"/>
-            </w:tcMar>
-            <w:vAlign w:val="center"/>
-          </w:tcPr>
-          <w:p>
-            <w:pPr>
-              <w:pStyle w:val="ds-markdown-paragraph"/>
-              <w:spacing w:before="280" w:after="0"/>
-              <w:rPr/>
-            </w:pPr>
-            <w:r>
-              <w:rPr/>
-              <w:t>Atouts pour la production</w:t>
-            </w:r>
-          </w:p>
-        </w:tc>
-      </w:tr>
-      <w:tr>
-        <w:trPr/>
-        <w:tc>
-          <w:tcPr>
-            <w:tcW w:w="1657" w:type="dxa"/>
-            <w:tcBorders>
-              <w:top w:val="single" w:sz="4" w:space="0" w:color="000000"/>
-              <w:left w:val="single" w:sz="4" w:space="0" w:color="000000"/>
-              <w:bottom w:val="single" w:sz="4" w:space="0" w:color="000000"/>
-              <w:right w:val="single" w:sz="4" w:space="0" w:color="000000"/>
-            </w:tcBorders>
-            <w:vAlign w:val="center"/>
-          </w:tcPr>
-          <w:p>
-            <w:pPr>
-              <w:pStyle w:val="ds-markdown-paragraph"/>
-              <w:spacing w:before="280" w:after="0"/>
-              <w:rPr>
-                <w:b/>
-                <w:bCs/>
-              </w:rPr>
-            </w:pPr>
-            <w:r>
-              <w:rPr>
-                <w:b/>
-                <w:bCs/>
-              </w:rPr>
-              <w:t>Sugar Baby</w:t>
-            </w:r>
-          </w:p>
-        </w:tc>
-        <w:tc>
-          <w:tcPr>
-            <w:tcW w:w="1867" w:type="dxa"/>
-            <w:tcBorders>
-              <w:top w:val="single" w:sz="4" w:space="0" w:color="000000"/>
-              <w:left w:val="single" w:sz="4" w:space="0" w:color="000000"/>
-              <w:bottom w:val="single" w:sz="4" w:space="0" w:color="000000"/>
-              <w:right w:val="single" w:sz="4" w:space="0" w:color="000000"/>
-            </w:tcBorders>
-            <w:tcMar>
-              <w:left w:w="240" w:type="dxa"/>
-            </w:tcMar>
-            <w:vAlign w:val="center"/>
-          </w:tcPr>
-          <w:p>
-            <w:pPr>
-              <w:pStyle w:val="ds-markdown-paragraph"/>
-              <w:spacing w:before="280" w:after="0"/>
-              <w:rPr>
-                <w:i/>
-                <w:i/>
-                <w:iCs/>
-              </w:rPr>
-            </w:pPr>
-            <w:r>
-              <w:rPr>
-                <w:i/>
-                <w:iCs/>
-              </w:rPr>
-              <w:t>Citrullus lanatus</w:t>
-            </w:r>
-          </w:p>
-        </w:tc>
-        <w:tc>
-          <w:tcPr>
-            <w:tcW w:w="1448" w:type="dxa"/>
-            <w:tcBorders>
-              <w:top w:val="single" w:sz="4" w:space="0" w:color="000000"/>
-              <w:left w:val="single" w:sz="4" w:space="0" w:color="000000"/>
-              <w:bottom w:val="single" w:sz="4" w:space="0" w:color="000000"/>
-              <w:right w:val="single" w:sz="4" w:space="0" w:color="000000"/>
-            </w:tcBorders>
-            <w:tcMar>
-              <w:left w:w="240" w:type="dxa"/>
-            </w:tcMar>
-            <w:vAlign w:val="center"/>
-          </w:tcPr>
-          <w:p>
-            <w:pPr>
-              <w:pStyle w:val="ds-markdown-paragraph"/>
-              <w:spacing w:before="280" w:after="0"/>
-              <w:rPr/>
-            </w:pPr>
-            <w:r>
-              <w:rPr/>
-              <w:t>Rouge</w:t>
-            </w:r>
-          </w:p>
-        </w:tc>
-        <w:tc>
-          <w:tcPr>
-            <w:tcW w:w="4912" w:type="dxa"/>
-            <w:tcBorders>
-              <w:top w:val="single" w:sz="4" w:space="0" w:color="000000"/>
-              <w:left w:val="single" w:sz="4" w:space="0" w:color="000000"/>
-              <w:bottom w:val="single" w:sz="4" w:space="0" w:color="000000"/>
-              <w:right w:val="single" w:sz="4" w:space="0" w:color="000000"/>
-            </w:tcBorders>
-            <w:tcMar>
-              <w:left w:w="240" w:type="dxa"/>
-              <w:right w:w="0" w:type="dxa"/>
-            </w:tcMar>
-            <w:vAlign w:val="center"/>
-          </w:tcPr>
-          <w:p>
-            <w:pPr>
-              <w:pStyle w:val="ds-markdown-paragraph"/>
-              <w:spacing w:before="280" w:after="0"/>
-              <w:rPr/>
-            </w:pPr>
-            <w:r>
-              <w:rPr/>
-              <w:t>Très populaire au Mali, résistante à la chaleur, fruits sucrés et juteux.</w:t>
-            </w:r>
-          </w:p>
-        </w:tc>
-      </w:tr>
-      <w:tr>
-        <w:trPr/>
-        <w:tc>
-          <w:tcPr>
-            <w:tcW w:w="1657" w:type="dxa"/>
-            <w:tcBorders>
-              <w:top w:val="single" w:sz="4" w:space="0" w:color="000000"/>
-              <w:left w:val="single" w:sz="4" w:space="0" w:color="000000"/>
-              <w:bottom w:val="single" w:sz="4" w:space="0" w:color="000000"/>
-              <w:right w:val="single" w:sz="4" w:space="0" w:color="000000"/>
-            </w:tcBorders>
-            <w:vAlign w:val="center"/>
-          </w:tcPr>
-          <w:p>
-            <w:pPr>
-              <w:pStyle w:val="ds-markdown-paragraph"/>
-              <w:spacing w:before="280" w:after="0"/>
-              <w:rPr>
-                <w:b/>
-                <w:bCs/>
-              </w:rPr>
-            </w:pPr>
-            <w:r>
-              <w:rPr>
-                <w:b/>
-                <w:bCs/>
-              </w:rPr>
-              <w:t>Crimson Sweet</w:t>
-            </w:r>
-          </w:p>
-        </w:tc>
-        <w:tc>
-          <w:tcPr>
-            <w:tcW w:w="1867" w:type="dxa"/>
-            <w:tcBorders>
-              <w:top w:val="single" w:sz="4" w:space="0" w:color="000000"/>
-              <w:left w:val="single" w:sz="4" w:space="0" w:color="000000"/>
-              <w:bottom w:val="single" w:sz="4" w:space="0" w:color="000000"/>
-              <w:right w:val="single" w:sz="4" w:space="0" w:color="000000"/>
-            </w:tcBorders>
-            <w:tcMar>
-              <w:left w:w="240" w:type="dxa"/>
-            </w:tcMar>
-            <w:vAlign w:val="center"/>
-          </w:tcPr>
-          <w:p>
-            <w:pPr>
-              <w:pStyle w:val="ds-markdown-paragraph"/>
-              <w:spacing w:before="280" w:after="0"/>
-              <w:rPr>
-                <w:i/>
-                <w:i/>
-                <w:iCs/>
-              </w:rPr>
-            </w:pPr>
-            <w:r>
-              <w:rPr>
-                <w:i/>
-                <w:iCs/>
-              </w:rPr>
-              <w:t>Citrullus lanatus</w:t>
-            </w:r>
-          </w:p>
-        </w:tc>
-        <w:tc>
-          <w:tcPr>
-            <w:tcW w:w="1448" w:type="dxa"/>
-            <w:tcBorders>
-              <w:top w:val="single" w:sz="4" w:space="0" w:color="000000"/>
-              <w:left w:val="single" w:sz="4" w:space="0" w:color="000000"/>
-              <w:bottom w:val="single" w:sz="4" w:space="0" w:color="000000"/>
-              <w:right w:val="single" w:sz="4" w:space="0" w:color="000000"/>
-            </w:tcBorders>
-            <w:tcMar>
-              <w:left w:w="240" w:type="dxa"/>
-            </w:tcMar>
-            <w:vAlign w:val="center"/>
-          </w:tcPr>
-          <w:p>
-            <w:pPr>
-              <w:pStyle w:val="ds-markdown-paragraph"/>
-              <w:spacing w:before="280" w:after="0"/>
-              <w:rPr/>
-            </w:pPr>
-            <w:r>
-              <w:rPr/>
-              <w:t>Rouge</w:t>
-            </w:r>
-          </w:p>
-        </w:tc>
-        <w:tc>
-          <w:tcPr>
-            <w:tcW w:w="4912" w:type="dxa"/>
-            <w:tcBorders>
-              <w:top w:val="single" w:sz="4" w:space="0" w:color="000000"/>
-              <w:left w:val="single" w:sz="4" w:space="0" w:color="000000"/>
-              <w:bottom w:val="single" w:sz="4" w:space="0" w:color="000000"/>
-              <w:right w:val="single" w:sz="4" w:space="0" w:color="000000"/>
-            </w:tcBorders>
-            <w:tcMar>
-              <w:left w:w="240" w:type="dxa"/>
-              <w:right w:w="0" w:type="dxa"/>
-            </w:tcMar>
-            <w:vAlign w:val="center"/>
-          </w:tcPr>
-          <w:p>
-            <w:pPr>
-              <w:pStyle w:val="ds-markdown-paragraph"/>
-              <w:spacing w:before="280" w:after="0"/>
-              <w:rPr/>
-            </w:pPr>
-            <w:r>
-              <w:rPr/>
-              <w:t>Bien adaptée aux climats chauds et secs, chair rouge foncé très sucrée.</w:t>
-            </w:r>
-          </w:p>
-        </w:tc>
-      </w:tr>
-      <w:tr>
-        <w:trPr/>
-        <w:tc>
-          <w:tcPr>
-            <w:tcW w:w="1657" w:type="dxa"/>
-            <w:tcBorders>
-              <w:top w:val="single" w:sz="4" w:space="0" w:color="000000"/>
-              <w:left w:val="single" w:sz="4" w:space="0" w:color="000000"/>
-              <w:bottom w:val="single" w:sz="4" w:space="0" w:color="000000"/>
-              <w:right w:val="single" w:sz="4" w:space="0" w:color="000000"/>
-            </w:tcBorders>
-            <w:vAlign w:val="center"/>
-          </w:tcPr>
-          <w:p>
-            <w:pPr>
-              <w:pStyle w:val="ds-markdown-paragraph"/>
-              <w:spacing w:before="280" w:after="0"/>
-              <w:rPr>
-                <w:b/>
-                <w:bCs/>
-              </w:rPr>
-            </w:pPr>
-            <w:r>
-              <w:rPr>
-                <w:b/>
-                <w:bCs/>
-              </w:rPr>
-              <w:t>Charleston Grey</w:t>
-            </w:r>
-          </w:p>
-        </w:tc>
-        <w:tc>
-          <w:tcPr>
-            <w:tcW w:w="1867" w:type="dxa"/>
-            <w:tcBorders>
-              <w:top w:val="single" w:sz="4" w:space="0" w:color="000000"/>
-              <w:left w:val="single" w:sz="4" w:space="0" w:color="000000"/>
-              <w:bottom w:val="single" w:sz="4" w:space="0" w:color="000000"/>
-              <w:right w:val="single" w:sz="4" w:space="0" w:color="000000"/>
-            </w:tcBorders>
-            <w:tcMar>
-              <w:left w:w="240" w:type="dxa"/>
-            </w:tcMar>
-            <w:vAlign w:val="center"/>
-          </w:tcPr>
-          <w:p>
-            <w:pPr>
-              <w:pStyle w:val="ds-markdown-paragraph"/>
-              <w:spacing w:before="280" w:after="0"/>
-              <w:rPr>
-                <w:i/>
-                <w:i/>
-                <w:iCs/>
-              </w:rPr>
-            </w:pPr>
-            <w:r>
-              <w:rPr>
-                <w:i/>
-                <w:iCs/>
-              </w:rPr>
-              <w:t>Citrullus lanatus</w:t>
-            </w:r>
-          </w:p>
-        </w:tc>
-        <w:tc>
-          <w:tcPr>
-            <w:tcW w:w="1448" w:type="dxa"/>
-            <w:tcBorders>
-              <w:top w:val="single" w:sz="4" w:space="0" w:color="000000"/>
-              <w:left w:val="single" w:sz="4" w:space="0" w:color="000000"/>
-              <w:bottom w:val="single" w:sz="4" w:space="0" w:color="000000"/>
-              <w:right w:val="single" w:sz="4" w:space="0" w:color="000000"/>
-            </w:tcBorders>
-            <w:tcMar>
-              <w:left w:w="240" w:type="dxa"/>
-            </w:tcMar>
-            <w:vAlign w:val="center"/>
-          </w:tcPr>
-          <w:p>
-            <w:pPr>
-              <w:pStyle w:val="ds-markdown-paragraph"/>
-              <w:spacing w:before="280" w:after="0"/>
-              <w:rPr/>
-            </w:pPr>
-            <w:r>
-              <w:rPr/>
-              <w:t>Rouge</w:t>
-            </w:r>
-          </w:p>
-        </w:tc>
-        <w:tc>
-          <w:tcPr>
-            <w:tcW w:w="4912" w:type="dxa"/>
-            <w:tcBorders>
-              <w:top w:val="single" w:sz="4" w:space="0" w:color="000000"/>
-              <w:left w:val="single" w:sz="4" w:space="0" w:color="000000"/>
-              <w:bottom w:val="single" w:sz="4" w:space="0" w:color="000000"/>
-              <w:right w:val="single" w:sz="4" w:space="0" w:color="000000"/>
-            </w:tcBorders>
-            <w:tcMar>
-              <w:left w:w="240" w:type="dxa"/>
-              <w:right w:w="0" w:type="dxa"/>
-            </w:tcMar>
-            <w:vAlign w:val="center"/>
-          </w:tcPr>
-          <w:p>
-            <w:pPr>
-              <w:pStyle w:val="ds-markdown-paragraph"/>
-              <w:spacing w:before="280" w:after="0"/>
-              <w:rPr/>
-            </w:pPr>
-            <w:r>
-              <w:rPr/>
-              <w:t>Très résistante à la sécheresse, fruits de grande taille, bonne conservation.</w:t>
-            </w:r>
-          </w:p>
-        </w:tc>
-      </w:tr>
-      <w:tr>
-        <w:trPr/>
-        <w:tc>
-          <w:tcPr>
-            <w:tcW w:w="1657" w:type="dxa"/>
-            <w:tcBorders>
-              <w:top w:val="single" w:sz="4" w:space="0" w:color="000000"/>
-              <w:left w:val="single" w:sz="4" w:space="0" w:color="000000"/>
-              <w:bottom w:val="single" w:sz="4" w:space="0" w:color="000000"/>
-              <w:right w:val="single" w:sz="4" w:space="0" w:color="000000"/>
-            </w:tcBorders>
-            <w:vAlign w:val="center"/>
-          </w:tcPr>
-          <w:p>
-            <w:pPr>
-              <w:pStyle w:val="ds-markdown-paragraph"/>
-              <w:spacing w:before="280" w:after="0"/>
-              <w:rPr>
-                <w:b/>
-                <w:bCs/>
-              </w:rPr>
-            </w:pPr>
-            <w:r>
-              <w:rPr>
-                <w:b/>
-                <w:bCs/>
-              </w:rPr>
-              <w:t>Black Diamond</w:t>
-            </w:r>
-          </w:p>
-        </w:tc>
-        <w:tc>
-          <w:tcPr>
-            <w:tcW w:w="1867" w:type="dxa"/>
-            <w:tcBorders>
-              <w:top w:val="single" w:sz="4" w:space="0" w:color="000000"/>
-              <w:left w:val="single" w:sz="4" w:space="0" w:color="000000"/>
-              <w:bottom w:val="single" w:sz="4" w:space="0" w:color="000000"/>
-              <w:right w:val="single" w:sz="4" w:space="0" w:color="000000"/>
-            </w:tcBorders>
-            <w:tcMar>
-              <w:left w:w="240" w:type="dxa"/>
-            </w:tcMar>
-            <w:vAlign w:val="center"/>
-          </w:tcPr>
-          <w:p>
-            <w:pPr>
-              <w:pStyle w:val="ds-markdown-paragraph"/>
-              <w:spacing w:before="280" w:after="0"/>
-              <w:rPr>
-                <w:i/>
-                <w:i/>
-                <w:iCs/>
-              </w:rPr>
-            </w:pPr>
-            <w:r>
-              <w:rPr>
-                <w:i/>
-                <w:iCs/>
-              </w:rPr>
-              <w:t>Citrullus lanatus</w:t>
-            </w:r>
-          </w:p>
-        </w:tc>
-        <w:tc>
-          <w:tcPr>
-            <w:tcW w:w="1448" w:type="dxa"/>
-            <w:tcBorders>
-              <w:top w:val="single" w:sz="4" w:space="0" w:color="000000"/>
-              <w:left w:val="single" w:sz="4" w:space="0" w:color="000000"/>
-              <w:bottom w:val="single" w:sz="4" w:space="0" w:color="000000"/>
-              <w:right w:val="single" w:sz="4" w:space="0" w:color="000000"/>
-            </w:tcBorders>
-            <w:tcMar>
-              <w:left w:w="240" w:type="dxa"/>
-            </w:tcMar>
-            <w:vAlign w:val="center"/>
-          </w:tcPr>
-          <w:p>
-            <w:pPr>
-              <w:pStyle w:val="ds-markdown-paragraph"/>
-              <w:spacing w:before="280" w:after="0"/>
-              <w:rPr/>
-            </w:pPr>
-            <w:r>
-              <w:rPr/>
-              <w:t>Rouge</w:t>
-            </w:r>
-          </w:p>
-        </w:tc>
-        <w:tc>
-          <w:tcPr>
-            <w:tcW w:w="4912" w:type="dxa"/>
-            <w:tcBorders>
-              <w:top w:val="single" w:sz="4" w:space="0" w:color="000000"/>
-              <w:left w:val="single" w:sz="4" w:space="0" w:color="000000"/>
-              <w:bottom w:val="single" w:sz="4" w:space="0" w:color="000000"/>
-              <w:right w:val="single" w:sz="4" w:space="0" w:color="000000"/>
-            </w:tcBorders>
-            <w:tcMar>
-              <w:left w:w="240" w:type="dxa"/>
-              <w:right w:w="0" w:type="dxa"/>
-            </w:tcMar>
-            <w:vAlign w:val="center"/>
-          </w:tcPr>
-          <w:p>
-            <w:pPr>
-              <w:pStyle w:val="ds-markdown-paragraph"/>
-              <w:spacing w:before="280" w:after="0"/>
-              <w:rPr/>
-            </w:pPr>
-            <w:r>
-              <w:rPr/>
-              <w:t>Adaptée aux climats chauds et secs, fruits de grande taille, chair rouge foncé.</w:t>
-            </w:r>
-          </w:p>
-        </w:tc>
-      </w:tr>
-      <w:tr>
-        <w:trPr/>
-        <w:tc>
-          <w:tcPr>
-            <w:tcW w:w="1657" w:type="dxa"/>
-            <w:tcBorders>
-              <w:top w:val="single" w:sz="4" w:space="0" w:color="000000"/>
-              <w:left w:val="single" w:sz="4" w:space="0" w:color="000000"/>
-              <w:bottom w:val="single" w:sz="4" w:space="0" w:color="000000"/>
-              <w:right w:val="single" w:sz="4" w:space="0" w:color="000000"/>
-            </w:tcBorders>
-            <w:vAlign w:val="center"/>
-          </w:tcPr>
-          <w:p>
-            <w:pPr>
-              <w:pStyle w:val="ds-markdown-paragraph"/>
-              <w:spacing w:before="280" w:after="0"/>
-              <w:rPr>
-                <w:b/>
-                <w:bCs/>
-              </w:rPr>
-            </w:pPr>
-            <w:r>
-              <w:rPr>
-                <w:b/>
-                <w:bCs/>
-              </w:rPr>
-              <w:t>Malali</w:t>
-            </w:r>
-          </w:p>
-        </w:tc>
-        <w:tc>
-          <w:tcPr>
-            <w:tcW w:w="1867" w:type="dxa"/>
-            <w:tcBorders>
-              <w:top w:val="single" w:sz="4" w:space="0" w:color="000000"/>
-              <w:left w:val="single" w:sz="4" w:space="0" w:color="000000"/>
-              <w:bottom w:val="single" w:sz="4" w:space="0" w:color="000000"/>
-              <w:right w:val="single" w:sz="4" w:space="0" w:color="000000"/>
-            </w:tcBorders>
-            <w:tcMar>
-              <w:left w:w="240" w:type="dxa"/>
-            </w:tcMar>
-            <w:vAlign w:val="center"/>
-          </w:tcPr>
-          <w:p>
-            <w:pPr>
-              <w:pStyle w:val="ds-markdown-paragraph"/>
-              <w:spacing w:before="280" w:after="0"/>
-              <w:rPr>
-                <w:i/>
-                <w:i/>
-                <w:iCs/>
-              </w:rPr>
-            </w:pPr>
-            <w:r>
-              <w:rPr>
-                <w:i/>
-                <w:iCs/>
-              </w:rPr>
-              <w:t>Citrullus lanatus</w:t>
-            </w:r>
-          </w:p>
-        </w:tc>
-        <w:tc>
-          <w:tcPr>
-            <w:tcW w:w="1448" w:type="dxa"/>
-            <w:tcBorders>
-              <w:top w:val="single" w:sz="4" w:space="0" w:color="000000"/>
-              <w:left w:val="single" w:sz="4" w:space="0" w:color="000000"/>
-              <w:bottom w:val="single" w:sz="4" w:space="0" w:color="000000"/>
-              <w:right w:val="single" w:sz="4" w:space="0" w:color="000000"/>
-            </w:tcBorders>
-            <w:tcMar>
-              <w:left w:w="240" w:type="dxa"/>
-            </w:tcMar>
-            <w:vAlign w:val="center"/>
-          </w:tcPr>
-          <w:p>
-            <w:pPr>
-              <w:pStyle w:val="ds-markdown-paragraph"/>
-              <w:spacing w:before="280" w:after="0"/>
-              <w:rPr/>
-            </w:pPr>
-            <w:r>
-              <w:rPr/>
-              <w:t>Rouge</w:t>
-            </w:r>
-          </w:p>
-        </w:tc>
-        <w:tc>
-          <w:tcPr>
-            <w:tcW w:w="4912" w:type="dxa"/>
-            <w:tcBorders>
-              <w:top w:val="single" w:sz="4" w:space="0" w:color="000000"/>
-              <w:left w:val="single" w:sz="4" w:space="0" w:color="000000"/>
-              <w:bottom w:val="single" w:sz="4" w:space="0" w:color="000000"/>
-              <w:right w:val="single" w:sz="4" w:space="0" w:color="000000"/>
-            </w:tcBorders>
-            <w:tcMar>
-              <w:left w:w="240" w:type="dxa"/>
-              <w:right w:w="0" w:type="dxa"/>
-            </w:tcMar>
-            <w:vAlign w:val="center"/>
-          </w:tcPr>
-          <w:p>
-            <w:pPr>
-              <w:pStyle w:val="ds-markdown-paragraph"/>
-              <w:spacing w:before="280" w:after="0"/>
-              <w:rPr/>
-            </w:pPr>
-            <w:r>
-              <w:rPr/>
-              <w:t>Très résistante à la sécheresse, fruits très sucrés.</w:t>
-            </w:r>
-          </w:p>
-        </w:tc>
-      </w:tr>
-      <w:tr>
-        <w:trPr/>
-        <w:tc>
-          <w:tcPr>
-            <w:tcW w:w="1657" w:type="dxa"/>
-            <w:tcBorders>
-              <w:top w:val="single" w:sz="4" w:space="0" w:color="000000"/>
-              <w:left w:val="single" w:sz="4" w:space="0" w:color="000000"/>
-              <w:bottom w:val="single" w:sz="4" w:space="0" w:color="000000"/>
-              <w:right w:val="single" w:sz="4" w:space="0" w:color="000000"/>
-            </w:tcBorders>
-            <w:vAlign w:val="center"/>
-          </w:tcPr>
-          <w:p>
-            <w:pPr>
-              <w:pStyle w:val="ds-markdown-paragraph"/>
-              <w:spacing w:before="280" w:after="0"/>
-              <w:rPr>
-                <w:b/>
-                <w:bCs/>
-              </w:rPr>
-            </w:pPr>
-            <w:r>
-              <w:rPr>
-                <w:b/>
-                <w:bCs/>
-              </w:rPr>
-              <w:t>Kaolack</w:t>
-            </w:r>
-          </w:p>
-        </w:tc>
-        <w:tc>
-          <w:tcPr>
-            <w:tcW w:w="1867" w:type="dxa"/>
-            <w:tcBorders>
-              <w:top w:val="single" w:sz="4" w:space="0" w:color="000000"/>
-              <w:left w:val="single" w:sz="4" w:space="0" w:color="000000"/>
-              <w:bottom w:val="single" w:sz="4" w:space="0" w:color="000000"/>
-              <w:right w:val="single" w:sz="4" w:space="0" w:color="000000"/>
-            </w:tcBorders>
-            <w:tcMar>
-              <w:left w:w="240" w:type="dxa"/>
-            </w:tcMar>
-            <w:vAlign w:val="center"/>
-          </w:tcPr>
-          <w:p>
-            <w:pPr>
-              <w:pStyle w:val="ds-markdown-paragraph"/>
-              <w:spacing w:before="280" w:after="0"/>
-              <w:rPr>
-                <w:i/>
-                <w:i/>
-                <w:iCs/>
-              </w:rPr>
-            </w:pPr>
-            <w:r>
-              <w:rPr>
-                <w:i/>
-                <w:iCs/>
-              </w:rPr>
-              <w:t>Citrullus lanatus</w:t>
-            </w:r>
-          </w:p>
-        </w:tc>
-        <w:tc>
-          <w:tcPr>
-            <w:tcW w:w="1448" w:type="dxa"/>
-            <w:tcBorders>
-              <w:top w:val="single" w:sz="4" w:space="0" w:color="000000"/>
-              <w:left w:val="single" w:sz="4" w:space="0" w:color="000000"/>
-              <w:bottom w:val="single" w:sz="4" w:space="0" w:color="000000"/>
-              <w:right w:val="single" w:sz="4" w:space="0" w:color="000000"/>
-            </w:tcBorders>
-            <w:tcMar>
-              <w:left w:w="240" w:type="dxa"/>
-            </w:tcMar>
-            <w:vAlign w:val="center"/>
-          </w:tcPr>
-          <w:p>
-            <w:pPr>
-              <w:pStyle w:val="ds-markdown-paragraph"/>
-              <w:spacing w:before="280" w:after="0"/>
-              <w:rPr/>
-            </w:pPr>
-            <w:r>
-              <w:rPr/>
-              <w:t>Rouge</w:t>
-            </w:r>
-          </w:p>
-        </w:tc>
-        <w:tc>
-          <w:tcPr>
-            <w:tcW w:w="4912" w:type="dxa"/>
-            <w:tcBorders>
-              <w:top w:val="single" w:sz="4" w:space="0" w:color="000000"/>
-              <w:left w:val="single" w:sz="4" w:space="0" w:color="000000"/>
-              <w:bottom w:val="single" w:sz="4" w:space="0" w:color="000000"/>
-              <w:right w:val="single" w:sz="4" w:space="0" w:color="000000"/>
-            </w:tcBorders>
-            <w:tcMar>
-              <w:left w:w="240" w:type="dxa"/>
-              <w:right w:w="0" w:type="dxa"/>
-            </w:tcMar>
-            <w:vAlign w:val="center"/>
-          </w:tcPr>
-          <w:p>
-            <w:pPr>
-              <w:pStyle w:val="ds-markdown-paragraph"/>
-              <w:spacing w:before="280" w:after="0"/>
-              <w:rPr/>
-            </w:pPr>
-            <w:r>
-              <w:rPr/>
-              <w:t>Variété sahélienne reconnue pour sa douceur exceptionnelle (taux de sucre élevé).</w:t>
-            </w:r>
-          </w:p>
-        </w:tc>
-      </w:tr>
-      <w:tr>
-        <w:trPr/>
-        <w:tc>
-          <w:tcPr>
-            <w:tcW w:w="1657" w:type="dxa"/>
-            <w:tcBorders>
-              <w:top w:val="single" w:sz="4" w:space="0" w:color="000000"/>
-              <w:left w:val="single" w:sz="4" w:space="0" w:color="000000"/>
-              <w:bottom w:val="single" w:sz="4" w:space="0" w:color="000000"/>
-              <w:right w:val="single" w:sz="4" w:space="0" w:color="000000"/>
-            </w:tcBorders>
-            <w:vAlign w:val="center"/>
-          </w:tcPr>
-          <w:p>
-            <w:pPr>
-              <w:pStyle w:val="ds-markdown-paragraph"/>
-              <w:spacing w:before="280" w:after="0"/>
-              <w:rPr>
-                <w:b/>
-                <w:bCs/>
-              </w:rPr>
-            </w:pPr>
-            <w:r>
-              <w:rPr>
-                <w:b/>
-                <w:bCs/>
-              </w:rPr>
-              <w:t>Kankani</w:t>
-            </w:r>
-          </w:p>
-        </w:tc>
-        <w:tc>
-          <w:tcPr>
-            <w:tcW w:w="1867" w:type="dxa"/>
-            <w:tcBorders>
-              <w:top w:val="single" w:sz="4" w:space="0" w:color="000000"/>
-              <w:left w:val="single" w:sz="4" w:space="0" w:color="000000"/>
-              <w:bottom w:val="single" w:sz="4" w:space="0" w:color="000000"/>
-              <w:right w:val="single" w:sz="4" w:space="0" w:color="000000"/>
-            </w:tcBorders>
-            <w:tcMar>
-              <w:left w:w="240" w:type="dxa"/>
-            </w:tcMar>
-            <w:vAlign w:val="center"/>
-          </w:tcPr>
-          <w:p>
-            <w:pPr>
-              <w:pStyle w:val="ds-markdown-paragraph"/>
-              <w:spacing w:before="280" w:after="0"/>
-              <w:rPr>
-                <w:i/>
-                <w:i/>
-                <w:iCs/>
-              </w:rPr>
-            </w:pPr>
-            <w:r>
-              <w:rPr>
-                <w:i/>
-                <w:iCs/>
-              </w:rPr>
-              <w:t>Citrullus lanatus</w:t>
-            </w:r>
-          </w:p>
-        </w:tc>
-        <w:tc>
-          <w:tcPr>
-            <w:tcW w:w="1448" w:type="dxa"/>
-            <w:tcBorders>
-              <w:top w:val="single" w:sz="4" w:space="0" w:color="000000"/>
-              <w:left w:val="single" w:sz="4" w:space="0" w:color="000000"/>
-              <w:bottom w:val="single" w:sz="4" w:space="0" w:color="000000"/>
-              <w:right w:val="single" w:sz="4" w:space="0" w:color="000000"/>
-            </w:tcBorders>
-            <w:tcMar>
-              <w:left w:w="240" w:type="dxa"/>
-            </w:tcMar>
-            <w:vAlign w:val="center"/>
-          </w:tcPr>
-          <w:p>
-            <w:pPr>
-              <w:pStyle w:val="ds-markdown-paragraph"/>
-              <w:spacing w:before="280" w:after="0"/>
-              <w:rPr/>
-            </w:pPr>
-            <w:r>
-              <w:rPr/>
-              <w:t>Rouge</w:t>
-            </w:r>
-          </w:p>
-        </w:tc>
-        <w:tc>
-          <w:tcPr>
-            <w:tcW w:w="4912" w:type="dxa"/>
-            <w:tcBorders>
-              <w:top w:val="single" w:sz="4" w:space="0" w:color="000000"/>
-              <w:left w:val="single" w:sz="4" w:space="0" w:color="000000"/>
-              <w:bottom w:val="single" w:sz="4" w:space="0" w:color="000000"/>
-              <w:right w:val="single" w:sz="4" w:space="0" w:color="000000"/>
-            </w:tcBorders>
-            <w:tcMar>
-              <w:left w:w="240" w:type="dxa"/>
-              <w:right w:w="0" w:type="dxa"/>
-            </w:tcMar>
-            <w:vAlign w:val="center"/>
-          </w:tcPr>
-          <w:p>
-            <w:pPr>
-              <w:pStyle w:val="ds-markdown-paragraph"/>
-              <w:spacing w:before="280" w:after="0"/>
-              <w:rPr/>
-            </w:pPr>
-            <w:r>
-              <w:rPr/>
-              <w:t>Type dessert cultivé localement au Mali, adapté aux conditions sahéliennes.</w:t>
-            </w:r>
-          </w:p>
-        </w:tc>
-      </w:tr>
-      <w:tr>
-        <w:trPr/>
-        <w:tc>
-          <w:tcPr>
-            <w:tcW w:w="1657" w:type="dxa"/>
-            <w:tcBorders>
-              <w:top w:val="single" w:sz="4" w:space="0" w:color="000000"/>
-              <w:left w:val="single" w:sz="4" w:space="0" w:color="000000"/>
-              <w:bottom w:val="single" w:sz="4" w:space="0" w:color="000000"/>
-              <w:right w:val="single" w:sz="4" w:space="0" w:color="000000"/>
-            </w:tcBorders>
-            <w:vAlign w:val="center"/>
-          </w:tcPr>
-          <w:p>
-            <w:pPr>
-              <w:pStyle w:val="ds-markdown-paragraph"/>
-              <w:spacing w:before="280" w:after="0"/>
-              <w:rPr>
-                <w:b/>
-                <w:bCs/>
-              </w:rPr>
-            </w:pPr>
-            <w:r>
-              <w:rPr>
-                <w:b/>
-                <w:bCs/>
-              </w:rPr>
-              <w:t>Koloss</w:t>
-            </w:r>
-          </w:p>
-        </w:tc>
-        <w:tc>
-          <w:tcPr>
-            <w:tcW w:w="1867" w:type="dxa"/>
-            <w:tcBorders>
-              <w:top w:val="single" w:sz="4" w:space="0" w:color="000000"/>
-              <w:left w:val="single" w:sz="4" w:space="0" w:color="000000"/>
-              <w:bottom w:val="single" w:sz="4" w:space="0" w:color="000000"/>
-              <w:right w:val="single" w:sz="4" w:space="0" w:color="000000"/>
-            </w:tcBorders>
-            <w:tcMar>
-              <w:left w:w="240" w:type="dxa"/>
-            </w:tcMar>
-            <w:vAlign w:val="center"/>
-          </w:tcPr>
-          <w:p>
-            <w:pPr>
-              <w:pStyle w:val="ds-markdown-paragraph"/>
-              <w:spacing w:before="280" w:after="0"/>
-              <w:rPr>
-                <w:i/>
-                <w:i/>
-                <w:iCs/>
-              </w:rPr>
-            </w:pPr>
-            <w:r>
-              <w:rPr>
-                <w:i/>
-                <w:iCs/>
-              </w:rPr>
-              <w:t>Citrullus lanatus</w:t>
-            </w:r>
-          </w:p>
-        </w:tc>
-        <w:tc>
-          <w:tcPr>
-            <w:tcW w:w="1448" w:type="dxa"/>
-            <w:tcBorders>
-              <w:top w:val="single" w:sz="4" w:space="0" w:color="000000"/>
-              <w:left w:val="single" w:sz="4" w:space="0" w:color="000000"/>
-              <w:bottom w:val="single" w:sz="4" w:space="0" w:color="000000"/>
-              <w:right w:val="single" w:sz="4" w:space="0" w:color="000000"/>
-            </w:tcBorders>
-            <w:tcMar>
-              <w:left w:w="240" w:type="dxa"/>
-            </w:tcMar>
-            <w:vAlign w:val="center"/>
-          </w:tcPr>
-          <w:p>
-            <w:pPr>
-              <w:pStyle w:val="ds-markdown-paragraph"/>
-              <w:spacing w:before="280" w:after="0"/>
-              <w:rPr/>
-            </w:pPr>
-            <w:r>
-              <w:rPr/>
-              <w:t>Rouge</w:t>
-            </w:r>
-          </w:p>
-        </w:tc>
-        <w:tc>
-          <w:tcPr>
-            <w:tcW w:w="4912" w:type="dxa"/>
-            <w:tcBorders>
-              <w:top w:val="single" w:sz="4" w:space="0" w:color="000000"/>
-              <w:left w:val="single" w:sz="4" w:space="0" w:color="000000"/>
-              <w:bottom w:val="single" w:sz="4" w:space="0" w:color="000000"/>
-              <w:right w:val="single" w:sz="4" w:space="0" w:color="000000"/>
-            </w:tcBorders>
-            <w:tcMar>
-              <w:left w:w="240" w:type="dxa"/>
-              <w:right w:w="0" w:type="dxa"/>
-            </w:tcMar>
-            <w:vAlign w:val="center"/>
-          </w:tcPr>
-          <w:p>
-            <w:pPr>
-              <w:pStyle w:val="ds-markdown-paragraph"/>
-              <w:spacing w:before="280" w:after="0"/>
-              <w:rPr/>
-            </w:pPr>
-            <w:r>
-              <w:rPr/>
-              <w:t>Variété prisée pour sa chair douce et fraîche, très appréciée des consommateurs.</w:t>
-            </w:r>
-          </w:p>
-        </w:tc>
-      </w:tr>
-    </w:tbl>
-    <w:p>
-      <w:pPr>
-        <w:pStyle w:val="ds-markdown-paragraph"/>
-        <w:rPr/>
-      </w:pPr>
-      <w:r>
-        <w:rPr/>
-        <w:t>Ces variétés sont soit des variétés locales (landraces</w:t>
-      </w:r>
-      <w:r>
-        <w:rPr>
-          <w:b/>
-          <w:bCs/>
-        </w:rPr>
-        <w:t>)</w:t>
-      </w:r>
-      <w:r>
-        <w:rPr/>
-        <w:t xml:space="preserve"> sélectionnées par les agriculteurs maliens pour leur robustesse, soit des variétés hybrides éprouvées dans les conditions sahéliennes. Leur culture sur 0,25 hectare à N’gara, avec un système d’irrigation solaire maîtrisé, permettra d’obtenir des fruits de qualité supérieure, très appréciés des consommateurs de Bamako. Pour le piment, des variétés locales adaptées comme le « jaune fort</w:t>
-      </w:r>
-      <w:r>
-        <w:rPr>
-          <w:b/>
-          <w:bCs/>
-        </w:rPr>
-        <w:t xml:space="preserve"> »</w:t>
-      </w:r>
-      <w:r>
-        <w:rPr/>
-        <w:t xml:space="preserve"> seront privilégiées pour leur rusticité et leur rendement.</w:t>
       </w:r>
     </w:p>
     <w:p>
@@ -13014,7 +11902,7 @@
           <w:lang w:val="fr-CI"/>
         </w:rPr>
       </w:pPr>
-      <w:bookmarkStart w:id="14" w:name="__RefHeading___Toc24423_3508533786"/>
+      <w:bookmarkStart w:id="14" w:name="__RefHeading___Toc24110_4017987919"/>
       <w:bookmarkEnd w:id="14"/>
       <w:r>
         <w:rPr>
@@ -55223,26 +54111,6 @@
           <w:b w:val="false"/>
           <w:sz w:val="20"/>
         </w:rPr>
-        <w:t>Factures pro forma d’au moins deux fournisseurs pour les équipements principaux (kit solaire, pompe, système d’irrigation goutte-à-goutte) ;</w:t>
-      </w:r>
-    </w:p>
-    <w:p>
-      <w:pPr>
-        <w:pStyle w:val="Normal"/>
-        <w:rPr/>
-      </w:pPr>
-      <w:r>
-        <w:rPr>
-          <w:b w:val="false"/>
-          <w:sz w:val="20"/>
-        </w:rPr>
-        <w:t xml:space="preserve">– </w:t>
-      </w:r>
-      <w:r>
-        <w:rPr>
-          <w:b w:val="false"/>
-          <w:sz w:val="20"/>
-        </w:rPr>
         <w:t>Lettres d’intention ou engagements d’achat de deux ou trois clients (grossistes, détaillants, collectivités) ;</w:t>
       </w:r>
     </w:p>
@@ -55264,6 +54132,28 @@
           <w:sz w:val="20"/>
         </w:rPr>
         <w:t>Calendrier de production (semis, repiquage et récolte, avec une campagne par an).</w:t>
+      </w:r>
+    </w:p>
+    <w:p>
+      <w:pPr>
+        <w:pStyle w:val="Normal"/>
+        <w:rPr/>
+      </w:pPr>
+      <w:r>
+        <w:rPr/>
+      </w:r>
+    </w:p>
+    <w:p>
+      <w:pPr>
+        <w:pStyle w:val="Normal"/>
+        <w:rPr/>
+      </w:pPr>
+      <w:r>
+        <w:rPr>
+          <w:b w:val="false"/>
+          <w:sz w:val="20"/>
+        </w:rPr>
+        <w:t>Factures pro forma : la promotrice n’a pas fourni de factures pro forma à la date d’élaboration du présent plan d’affaires ; les montants retenus pour les équipements (kit solaire, pompe, système d’irrigation goutte-à-goutte) sont des estimations.</w:t>
       </w:r>
     </w:p>
     <w:sectPr>
@@ -55338,7 +54228,7 @@
     </w:r>
     <w:r>
       <w:rPr/>
-      <w:t>23</w:t>
+      <w:t>22</w:t>
     </w:r>
     <w:r>
       <w:rPr/>

</xml_diff>